<commit_message>
Add lab 4 function exercises and reports
Add variant 5 C++ examples demonstrating several function styles, along with lab 4 reports and supporting images. Update existing lab 1 and lab 3 documents.
</commit_message>
<xml_diff>
--- a/vichtech/lab3/отчет.docx
+++ b/vichtech/lab3/отчет.docx
@@ -6,16 +6,21 @@
       <w:pPr>
         <w:ind w:firstLine="0"/>
         <w:jc w:val="center"/>
+        <w:rPr>
+          <w:lang w:val="ru-RU"/>
+        </w:rPr>
       </w:pPr>
       <w:r>
         <w:rPr>
           <w:sz w:val="24"/>
+          <w:lang w:val="ru-RU"/>
         </w:rPr>
         <w:t>МИНИСТЕРСТВО ЦИФРОВОГО РАЗВИТИЯ, СВЯЗИ И МАССОВЫХ</w:t>
       </w:r>
       <w:r>
         <w:rPr>
           <w:sz w:val="24"/>
+          <w:lang w:val="ru-RU"/>
         </w:rPr>
         <w:br/>
         <w:t>КОММУНИКАЦИЙ РОССИЙСКОЙ ФЕДЕРАЦИИ</w:t>
@@ -25,16 +30,21 @@
       <w:pPr>
         <w:ind w:firstLine="0"/>
         <w:jc w:val="center"/>
+        <w:rPr>
+          <w:lang w:val="ru-RU"/>
+        </w:rPr>
       </w:pPr>
       <w:r>
         <w:rPr>
           <w:sz w:val="24"/>
+          <w:lang w:val="ru-RU"/>
         </w:rPr>
         <w:t>Ордена Трудового Красного Знамени федеральное государственное</w:t>
       </w:r>
       <w:r>
         <w:rPr>
           <w:sz w:val="24"/>
+          <w:lang w:val="ru-RU"/>
         </w:rPr>
         <w:br/>
         <w:t>бюджетное образовательное учреждение высшего образования</w:t>
@@ -42,6 +52,7 @@
       <w:r>
         <w:rPr>
           <w:sz w:val="24"/>
+          <w:lang w:val="ru-RU"/>
         </w:rPr>
         <w:br/>
         <w:t>«Московский технический университет связи и информатики»</w:t>
@@ -51,35 +62,74 @@
       <w:pPr>
         <w:ind w:firstLine="0"/>
         <w:jc w:val="center"/>
+        <w:rPr>
+          <w:lang w:val="ru-RU"/>
+        </w:rPr>
       </w:pPr>
       <w:r>
         <w:rPr>
           <w:sz w:val="24"/>
+          <w:lang w:val="ru-RU"/>
         </w:rPr>
         <w:t>Факультет «Информационные технологии»</w:t>
       </w:r>
       <w:r>
         <w:rPr>
           <w:sz w:val="24"/>
+          <w:lang w:val="ru-RU"/>
         </w:rPr>
         <w:br/>
         <w:t>Кафедра «Системное программирование»</w:t>
       </w:r>
     </w:p>
-    <w:p/>
-    <w:p/>
-    <w:p/>
-    <w:p/>
-    <w:p/>
+    <w:p>
+      <w:pPr>
+        <w:rPr>
+          <w:lang w:val="ru-RU"/>
+        </w:rPr>
+      </w:pPr>
+    </w:p>
+    <w:p>
+      <w:pPr>
+        <w:rPr>
+          <w:lang w:val="ru-RU"/>
+        </w:rPr>
+      </w:pPr>
+    </w:p>
+    <w:p>
+      <w:pPr>
+        <w:rPr>
+          <w:lang w:val="ru-RU"/>
+        </w:rPr>
+      </w:pPr>
+    </w:p>
+    <w:p>
+      <w:pPr>
+        <w:rPr>
+          <w:lang w:val="ru-RU"/>
+        </w:rPr>
+      </w:pPr>
+    </w:p>
+    <w:p>
+      <w:pPr>
+        <w:rPr>
+          <w:lang w:val="ru-RU"/>
+        </w:rPr>
+      </w:pPr>
+    </w:p>
     <w:p>
       <w:pPr>
         <w:ind w:firstLine="0"/>
         <w:jc w:val="center"/>
+        <w:rPr>
+          <w:lang w:val="ru-RU"/>
+        </w:rPr>
       </w:pPr>
       <w:r>
         <w:rPr>
           <w:b/>
           <w:sz w:val="32"/>
+          <w:lang w:val="ru-RU"/>
         </w:rPr>
         <w:t>Отчет по лабораторной работе №3</w:t>
       </w:r>
@@ -88,10 +138,14 @@
       <w:pPr>
         <w:ind w:firstLine="0"/>
         <w:jc w:val="center"/>
+        <w:rPr>
+          <w:lang w:val="ru-RU"/>
+        </w:rPr>
       </w:pPr>
       <w:r>
         <w:rPr>
           <w:b/>
+          <w:lang w:val="ru-RU"/>
         </w:rPr>
         <w:t>«Шифратор»</w:t>
       </w:r>
@@ -100,8 +154,14 @@
       <w:pPr>
         <w:ind w:firstLine="0"/>
         <w:jc w:val="center"/>
+        <w:rPr>
+          <w:lang w:val="ru-RU"/>
+        </w:rPr>
       </w:pPr>
       <w:r>
+        <w:rPr>
+          <w:lang w:val="ru-RU"/>
+        </w:rPr>
         <w:t>по дисциплине</w:t>
       </w:r>
     </w:p>
@@ -109,8 +169,14 @@
       <w:pPr>
         <w:ind w:firstLine="0"/>
         <w:jc w:val="center"/>
+        <w:rPr>
+          <w:lang w:val="ru-RU"/>
+        </w:rPr>
       </w:pPr>
       <w:r>
+        <w:rPr>
+          <w:lang w:val="ru-RU"/>
+        </w:rPr>
         <w:t>«Вычислительная техника»</w:t>
       </w:r>
     </w:p>
@@ -118,51 +184,134 @@
       <w:pPr>
         <w:ind w:firstLine="0"/>
         <w:jc w:val="center"/>
+        <w:rPr>
+          <w:lang w:val="ru-RU"/>
+        </w:rPr>
       </w:pPr>
       <w:r>
+        <w:rPr>
+          <w:lang w:val="ru-RU"/>
+        </w:rPr>
         <w:t>Вариант №7</w:t>
       </w:r>
     </w:p>
-    <w:p/>
-    <w:p/>
-    <w:p/>
+    <w:p>
+      <w:pPr>
+        <w:rPr>
+          <w:lang w:val="ru-RU"/>
+        </w:rPr>
+      </w:pPr>
+    </w:p>
+    <w:p>
+      <w:pPr>
+        <w:rPr>
+          <w:lang w:val="ru-RU"/>
+        </w:rPr>
+      </w:pPr>
+    </w:p>
+    <w:p>
+      <w:pPr>
+        <w:rPr>
+          <w:lang w:val="ru-RU"/>
+        </w:rPr>
+      </w:pPr>
+    </w:p>
     <w:p>
       <w:pPr>
         <w:ind w:firstLine="0"/>
         <w:jc w:val="right"/>
+        <w:rPr>
+          <w:lang w:val="ru-RU"/>
+        </w:rPr>
       </w:pPr>
       <w:r>
         <w:rPr>
           <w:sz w:val="24"/>
-        </w:rPr>
-        <w:t>Выполнил: студент гр БПС2601 Вахонин Максим Антонович</w:t>
+          <w:lang w:val="ru-RU"/>
+        </w:rPr>
+        <w:t xml:space="preserve">Выполнил: студент </w:t>
+      </w:r>
+      <w:proofErr w:type="spellStart"/>
+      <w:r>
+        <w:rPr>
+          <w:sz w:val="24"/>
+          <w:lang w:val="ru-RU"/>
+        </w:rPr>
+        <w:t>гр</w:t>
+      </w:r>
+      <w:proofErr w:type="spellEnd"/>
+      <w:r>
+        <w:rPr>
+          <w:sz w:val="24"/>
+          <w:lang w:val="ru-RU"/>
+        </w:rPr>
+        <w:t xml:space="preserve"> БПС2601 Вахонин Максим Антонович</w:t>
       </w:r>
     </w:p>
     <w:p>
       <w:pPr>
         <w:ind w:firstLine="0"/>
         <w:jc w:val="right"/>
+        <w:rPr>
+          <w:lang w:val="ru-RU"/>
+        </w:rPr>
       </w:pPr>
       <w:r>
         <w:rPr>
           <w:sz w:val="24"/>
+          <w:lang w:val="ru-RU"/>
         </w:rPr>
         <w:t>Проверил: Нехороший Ю.И., Кондратьева О. В.</w:t>
       </w:r>
     </w:p>
-    <w:p/>
-    <w:p/>
-    <w:p/>
-    <w:p/>
+    <w:p>
+      <w:pPr>
+        <w:rPr>
+          <w:lang w:val="ru-RU"/>
+        </w:rPr>
+      </w:pPr>
+    </w:p>
+    <w:p>
+      <w:pPr>
+        <w:rPr>
+          <w:lang w:val="ru-RU"/>
+        </w:rPr>
+      </w:pPr>
+    </w:p>
+    <w:p>
+      <w:pPr>
+        <w:rPr>
+          <w:lang w:val="ru-RU"/>
+        </w:rPr>
+      </w:pPr>
+    </w:p>
+    <w:p>
+      <w:pPr>
+        <w:rPr>
+          <w:lang w:val="ru-RU"/>
+        </w:rPr>
+      </w:pPr>
+    </w:p>
     <w:p>
       <w:pPr>
         <w:spacing w:after="0"/>
         <w:ind w:firstLine="0"/>
         <w:jc w:val="center"/>
+        <w:rPr>
+          <w:lang w:val="ru-RU"/>
+        </w:rPr>
       </w:pPr>
     </w:p>
     <w:p>
+      <w:pPr>
+        <w:rPr>
+          <w:lang w:val="ru-RU"/>
+        </w:rPr>
+      </w:pPr>
       <w:r>
+        <w:rPr>
+          <w:lang w:val="ru-RU"/>
+        </w:rPr>
         <w:br w:type="page"/>
       </w:r>
     </w:p>
@@ -171,6 +320,7 @@
         <w:ind w:firstLine="0"/>
         <w:jc w:val="center"/>
       </w:pPr>
+      <w:proofErr w:type="spellStart"/>
       <w:r>
         <w:rPr>
           <w:b/>
@@ -178,6 +328,7 @@
         <w:lastRenderedPageBreak/>
         <w:t>Оглавление</w:t>
       </w:r>
+      <w:proofErr w:type="spellEnd"/>
     </w:p>
     <w:p>
       <w:pPr>
@@ -667,60 +818,192 @@
     <w:p>
       <w:pPr>
         <w:ind w:firstLine="0"/>
+        <w:rPr>
+          <w:lang w:val="ru-RU"/>
+        </w:rPr>
       </w:pPr>
       <w:r>
         <w:fldChar w:fldCharType="end"/>
       </w:r>
+      <w:bookmarkStart w:id="0" w:name="_Toc243001092"/>
     </w:p>
-    <w:p>
-      <w:pPr>
-        <w:ind w:firstLine="0"/>
-      </w:pPr>
-    </w:p>
-    <w:p>
-      <w:pPr>
-        <w:ind w:firstLine="0"/>
-      </w:pPr>
-    </w:p>
-    <w:p>
-      <w:pPr>
-        <w:ind w:firstLine="0"/>
-      </w:pPr>
-    </w:p>
-    <w:p>
-      <w:pPr>
-        <w:ind w:firstLine="0"/>
-      </w:pPr>
-    </w:p>
-    <w:p>
-      <w:pPr>
-        <w:ind w:firstLine="0"/>
-      </w:pPr>
-    </w:p>
-    <w:p>
-      <w:pPr>
-        <w:ind w:firstLine="0"/>
-      </w:pPr>
-    </w:p>
-    <w:p/>
     <w:p>
       <w:pPr>
         <w:pStyle w:val="1"/>
         <w:ind w:firstLine="0"/>
         <w:jc w:val="center"/>
-      </w:pPr>
-      <w:bookmarkStart w:id="0" w:name="_Toc243001092"/>
+        <w:rPr>
+          <w:rFonts w:ascii="Times New Roman" w:eastAsia="Times New Roman" w:hAnsi="Times New Roman"/>
+          <w:lang w:val="ru-RU"/>
+        </w:rPr>
+      </w:pPr>
+    </w:p>
+    <w:p>
+      <w:pPr>
+        <w:pStyle w:val="1"/>
+        <w:ind w:firstLine="0"/>
+        <w:jc w:val="center"/>
+        <w:rPr>
+          <w:rFonts w:ascii="Times New Roman" w:eastAsia="Times New Roman" w:hAnsi="Times New Roman"/>
+          <w:lang w:val="ru-RU"/>
+        </w:rPr>
+      </w:pPr>
+    </w:p>
+    <w:p>
+      <w:pPr>
+        <w:pStyle w:val="1"/>
+        <w:ind w:firstLine="0"/>
+        <w:jc w:val="center"/>
+        <w:rPr>
+          <w:rFonts w:ascii="Times New Roman" w:eastAsia="Times New Roman" w:hAnsi="Times New Roman"/>
+          <w:lang w:val="ru-RU"/>
+        </w:rPr>
+      </w:pPr>
+    </w:p>
+    <w:p>
+      <w:pPr>
+        <w:pStyle w:val="1"/>
+        <w:ind w:firstLine="0"/>
+        <w:jc w:val="center"/>
+        <w:rPr>
+          <w:rFonts w:ascii="Times New Roman" w:eastAsia="Times New Roman" w:hAnsi="Times New Roman"/>
+          <w:lang w:val="ru-RU"/>
+        </w:rPr>
+      </w:pPr>
+    </w:p>
+    <w:p>
+      <w:pPr>
+        <w:pStyle w:val="1"/>
+        <w:ind w:firstLine="0"/>
+        <w:jc w:val="center"/>
+        <w:rPr>
+          <w:rFonts w:ascii="Times New Roman" w:eastAsia="Times New Roman" w:hAnsi="Times New Roman"/>
+          <w:lang w:val="ru-RU"/>
+        </w:rPr>
+      </w:pPr>
+    </w:p>
+    <w:p>
+      <w:pPr>
+        <w:pStyle w:val="1"/>
+        <w:ind w:firstLine="0"/>
+        <w:jc w:val="center"/>
+        <w:rPr>
+          <w:rFonts w:ascii="Times New Roman" w:eastAsia="Times New Roman" w:hAnsi="Times New Roman"/>
+          <w:lang w:val="ru-RU"/>
+        </w:rPr>
+      </w:pPr>
+    </w:p>
+    <w:p>
+      <w:pPr>
+        <w:pStyle w:val="1"/>
+        <w:ind w:firstLine="0"/>
+        <w:jc w:val="center"/>
+        <w:rPr>
+          <w:rFonts w:ascii="Times New Roman" w:eastAsia="Times New Roman" w:hAnsi="Times New Roman"/>
+          <w:lang w:val="ru-RU"/>
+        </w:rPr>
+      </w:pPr>
+    </w:p>
+    <w:p>
+      <w:pPr>
+        <w:pStyle w:val="1"/>
+        <w:ind w:firstLine="0"/>
+        <w:jc w:val="center"/>
+        <w:rPr>
+          <w:rFonts w:ascii="Times New Roman" w:eastAsia="Times New Roman" w:hAnsi="Times New Roman"/>
+          <w:lang w:val="ru-RU"/>
+        </w:rPr>
+      </w:pPr>
+    </w:p>
+    <w:p>
+      <w:pPr>
+        <w:pStyle w:val="1"/>
+        <w:ind w:firstLine="0"/>
+        <w:jc w:val="center"/>
+        <w:rPr>
+          <w:rFonts w:ascii="Times New Roman" w:eastAsia="Times New Roman" w:hAnsi="Times New Roman"/>
+          <w:lang w:val="ru-RU"/>
+        </w:rPr>
+      </w:pPr>
+    </w:p>
+    <w:p>
+      <w:pPr>
+        <w:pStyle w:val="1"/>
+        <w:ind w:firstLine="0"/>
+        <w:jc w:val="center"/>
+        <w:rPr>
+          <w:rFonts w:ascii="Times New Roman" w:eastAsia="Times New Roman" w:hAnsi="Times New Roman"/>
+          <w:lang w:val="ru-RU"/>
+        </w:rPr>
+      </w:pPr>
+    </w:p>
+    <w:p>
+      <w:pPr>
+        <w:pStyle w:val="1"/>
+        <w:ind w:firstLine="0"/>
+        <w:jc w:val="center"/>
+        <w:rPr>
+          <w:rFonts w:ascii="Times New Roman" w:eastAsia="Times New Roman" w:hAnsi="Times New Roman"/>
+          <w:lang w:val="ru-RU"/>
+        </w:rPr>
+      </w:pPr>
+    </w:p>
+    <w:p>
+      <w:pPr>
+        <w:pStyle w:val="1"/>
+        <w:ind w:firstLine="0"/>
+        <w:jc w:val="center"/>
+        <w:rPr>
+          <w:lang w:val="ru-RU"/>
+        </w:rPr>
+      </w:pPr>
       <w:r>
         <w:rPr>
           <w:rFonts w:ascii="Times New Roman" w:eastAsia="Times New Roman" w:hAnsi="Times New Roman"/>
+          <w:lang w:val="ru-RU"/>
         </w:rPr>
         <w:t>Цель работы</w:t>
       </w:r>
       <w:bookmarkEnd w:id="0"/>
     </w:p>
     <w:p>
+      <w:pPr>
+        <w:rPr>
+          <w:lang w:val="ru-RU"/>
+        </w:rPr>
+      </w:pPr>
       <w:r>
-        <w:t>Ознакомиться с основными характеристиками интегральных преобразователей кодов, получить навыки проектирования шифраторов. Изучить основные измерительные приборы и средства анализа среды разработки Logisim / Logisim evolution: генератор слов и логический анализатор. Научиться строить шифраторы и анализировать их работу. Проверить правильность выполнения практической работы №3.</w:t>
+        <w:rPr>
+          <w:lang w:val="ru-RU"/>
+        </w:rPr>
+        <w:t xml:space="preserve">Ознакомиться с основными характеристиками интегральных преобразователей кодов, получить навыки проектирования шифраторов. Изучить основные измерительные приборы и средства анализа среды разработки </w:t>
+      </w:r>
+      <w:r>
+        <w:t>Logisim</w:t>
+      </w:r>
+      <w:r>
+        <w:rPr>
+          <w:lang w:val="ru-RU"/>
+        </w:rPr>
+        <w:t xml:space="preserve"> / </w:t>
+      </w:r>
+      <w:r>
+        <w:t>Logisim</w:t>
+      </w:r>
+      <w:r>
+        <w:rPr>
+          <w:lang w:val="ru-RU"/>
+        </w:rPr>
+        <w:t xml:space="preserve"> </w:t>
+      </w:r>
+      <w:r>
+        <w:t>evolution</w:t>
+      </w:r>
+      <w:r>
+        <w:rPr>
+          <w:lang w:val="ru-RU"/>
+        </w:rPr>
+        <w:t>: генератор слов и логический анализатор. Научиться строить шифраторы и анализировать их работу. Проверить правильность выполнения практической работы №3.</w:t>
       </w:r>
     </w:p>
     <w:p>
@@ -728,34 +1011,97 @@
         <w:pStyle w:val="1"/>
         <w:ind w:firstLine="0"/>
         <w:jc w:val="center"/>
+        <w:rPr>
+          <w:lang w:val="ru-RU"/>
+        </w:rPr>
       </w:pPr>
       <w:bookmarkStart w:id="1" w:name="_Toc243001093"/>
       <w:r>
         <w:rPr>
           <w:rFonts w:ascii="Times New Roman" w:eastAsia="Times New Roman" w:hAnsi="Times New Roman"/>
+          <w:lang w:val="ru-RU"/>
         </w:rPr>
         <w:t>Задание лабораторной работы</w:t>
       </w:r>
       <w:bookmarkEnd w:id="1"/>
     </w:p>
     <w:p>
+      <w:pPr>
+        <w:rPr>
+          <w:lang w:val="ru-RU"/>
+        </w:rPr>
+      </w:pPr>
       <w:r>
-        <w:t>1. Согласно решению первого задания практической работы №3 построить логическую схему шифратора в системе Logisim / Logisim evolution и проверить правильность выполненной работы.</w:t>
+        <w:rPr>
+          <w:lang w:val="ru-RU"/>
+        </w:rPr>
+        <w:t xml:space="preserve">1. Согласно решению первого задания практической работы №3 построить логическую схему шифратора в системе </w:t>
+      </w:r>
+      <w:r>
+        <w:t>Logisim</w:t>
+      </w:r>
+      <w:r>
+        <w:rPr>
+          <w:lang w:val="ru-RU"/>
+        </w:rPr>
+        <w:t xml:space="preserve"> / </w:t>
+      </w:r>
+      <w:r>
+        <w:t>Logisim</w:t>
+      </w:r>
+      <w:r>
+        <w:rPr>
+          <w:lang w:val="ru-RU"/>
+        </w:rPr>
+        <w:t xml:space="preserve"> </w:t>
+      </w:r>
+      <w:r>
+        <w:t>evolution</w:t>
+      </w:r>
+      <w:r>
+        <w:rPr>
+          <w:lang w:val="ru-RU"/>
+        </w:rPr>
+        <w:t xml:space="preserve"> и проверить правильность выполненной работы.</w:t>
       </w:r>
     </w:p>
     <w:p>
+      <w:pPr>
+        <w:rPr>
+          <w:lang w:val="ru-RU"/>
+        </w:rPr>
+      </w:pPr>
       <w:r>
+        <w:rPr>
+          <w:lang w:val="ru-RU"/>
+        </w:rPr>
+        <w:lastRenderedPageBreak/>
         <w:t>2. По таблице истинности шифратора согласно варианту составить систему уравнений и начертить блок-схему на логических элементах.</w:t>
       </w:r>
     </w:p>
     <w:p>
+      <w:pPr>
+        <w:rPr>
+          <w:lang w:val="ru-RU"/>
+        </w:rPr>
+      </w:pPr>
       <w:r>
-        <w:lastRenderedPageBreak/>
+        <w:rPr>
+          <w:lang w:val="ru-RU"/>
+        </w:rPr>
         <w:t>3. Используя булеву функцию и её таблицу истинности из практической работы №2, построить таблицу истинности шифратора, составить систему уравнений и начертить блок-схему на логических элементах.</w:t>
       </w:r>
     </w:p>
     <w:p>
+      <w:pPr>
+        <w:rPr>
+          <w:lang w:val="ru-RU"/>
+        </w:rPr>
+      </w:pPr>
       <w:r>
+        <w:rPr>
+          <w:lang w:val="ru-RU"/>
+        </w:rPr>
         <w:br w:type="page"/>
       </w:r>
     </w:p>
@@ -764,11 +1110,15 @@
         <w:pStyle w:val="1"/>
         <w:ind w:firstLine="0"/>
         <w:jc w:val="center"/>
+        <w:rPr>
+          <w:lang w:val="ru-RU"/>
+        </w:rPr>
       </w:pPr>
       <w:bookmarkStart w:id="2" w:name="_Toc243001094"/>
       <w:r>
         <w:rPr>
           <w:rFonts w:ascii="Times New Roman" w:eastAsia="Times New Roman" w:hAnsi="Times New Roman"/>
+          <w:lang w:val="ru-RU"/>
         </w:rPr>
         <w:lastRenderedPageBreak/>
         <w:t>Результаты работы</w:t>
@@ -780,48 +1130,203 @@
         <w:pStyle w:val="21"/>
         <w:ind w:firstLine="0"/>
         <w:jc w:val="center"/>
+        <w:rPr>
+          <w:lang w:val="ru-RU"/>
+        </w:rPr>
       </w:pPr>
       <w:bookmarkStart w:id="3" w:name="_Toc243001095"/>
       <w:r>
         <w:rPr>
           <w:rFonts w:ascii="Times New Roman" w:eastAsia="Times New Roman" w:hAnsi="Times New Roman"/>
           <w:sz w:val="28"/>
+          <w:lang w:val="ru-RU"/>
         </w:rPr>
         <w:t>Задание № 1</w:t>
       </w:r>
       <w:bookmarkEnd w:id="3"/>
     </w:p>
     <w:p>
+      <w:pPr>
+        <w:rPr>
+          <w:lang w:val="ru-RU"/>
+        </w:rPr>
+      </w:pPr>
       <w:r>
+        <w:rPr>
+          <w:lang w:val="ru-RU"/>
+        </w:rPr>
         <w:t>Для шифратора составлена система логических уравнений. Каждый выход формируется логическим сложением соответствующих входов:</w:t>
       </w:r>
     </w:p>
     <w:p>
       <w:pPr>
         <w:ind w:firstLine="0"/>
+        <w:rPr>
+          <w:lang w:val="ru-RU"/>
+        </w:rPr>
       </w:pPr>
       <w:r>
-        <w:t>Y₁ = X₁ + X₃ + X₅ + X₇</w:t>
+        <w:t>Y</w:t>
+      </w:r>
+      <w:r>
+        <w:rPr>
+          <w:lang w:val="ru-RU"/>
+        </w:rPr>
+        <w:t xml:space="preserve">₁ = </w:t>
+      </w:r>
+      <w:r>
+        <w:t>X</w:t>
+      </w:r>
+      <w:r>
+        <w:rPr>
+          <w:lang w:val="ru-RU"/>
+        </w:rPr>
+        <w:t xml:space="preserve">₁ + </w:t>
+      </w:r>
+      <w:r>
+        <w:t>X</w:t>
+      </w:r>
+      <w:r>
+        <w:rPr>
+          <w:lang w:val="ru-RU"/>
+        </w:rPr>
+        <w:t xml:space="preserve">₃ + </w:t>
+      </w:r>
+      <w:r>
+        <w:t>X</w:t>
+      </w:r>
+      <w:r>
+        <w:rPr>
+          <w:lang w:val="ru-RU"/>
+        </w:rPr>
+        <w:t xml:space="preserve">₅ + </w:t>
+      </w:r>
+      <w:r>
+        <w:t>X</w:t>
+      </w:r>
+      <w:r>
+        <w:rPr>
+          <w:lang w:val="ru-RU"/>
+        </w:rPr>
+        <w:t>₇</w:t>
       </w:r>
     </w:p>
     <w:p>
       <w:pPr>
         <w:ind w:firstLine="0"/>
+        <w:rPr>
+          <w:lang w:val="ru-RU"/>
+        </w:rPr>
       </w:pPr>
       <w:r>
-        <w:t>Y₂ = X₂ + X₃ + X₆ + X₇</w:t>
+        <w:t>Y</w:t>
+      </w:r>
+      <w:r>
+        <w:rPr>
+          <w:lang w:val="ru-RU"/>
+        </w:rPr>
+        <w:t xml:space="preserve">₂ = </w:t>
+      </w:r>
+      <w:r>
+        <w:t>X</w:t>
+      </w:r>
+      <w:r>
+        <w:rPr>
+          <w:lang w:val="ru-RU"/>
+        </w:rPr>
+        <w:t xml:space="preserve">₂ + </w:t>
+      </w:r>
+      <w:r>
+        <w:t>X</w:t>
+      </w:r>
+      <w:r>
+        <w:rPr>
+          <w:lang w:val="ru-RU"/>
+        </w:rPr>
+        <w:t xml:space="preserve">₃ + </w:t>
+      </w:r>
+      <w:r>
+        <w:t>X</w:t>
+      </w:r>
+      <w:r>
+        <w:rPr>
+          <w:lang w:val="ru-RU"/>
+        </w:rPr>
+        <w:t xml:space="preserve">₆ + </w:t>
+      </w:r>
+      <w:r>
+        <w:t>X</w:t>
+      </w:r>
+      <w:r>
+        <w:rPr>
+          <w:lang w:val="ru-RU"/>
+        </w:rPr>
+        <w:t>₇</w:t>
       </w:r>
     </w:p>
     <w:p>
       <w:pPr>
         <w:ind w:firstLine="0"/>
+        <w:rPr>
+          <w:lang w:val="ru-RU"/>
+        </w:rPr>
       </w:pPr>
       <w:r>
-        <w:t>Y₃ = X₄ + X₅ + X₆ + X₇</w:t>
+        <w:t>Y</w:t>
+      </w:r>
+      <w:r>
+        <w:rPr>
+          <w:lang w:val="ru-RU"/>
+        </w:rPr>
+        <w:t xml:space="preserve">₃ = </w:t>
+      </w:r>
+      <w:r>
+        <w:t>X</w:t>
+      </w:r>
+      <w:r>
+        <w:rPr>
+          <w:lang w:val="ru-RU"/>
+        </w:rPr>
+        <w:t xml:space="preserve">₄ + </w:t>
+      </w:r>
+      <w:r>
+        <w:t>X</w:t>
+      </w:r>
+      <w:r>
+        <w:rPr>
+          <w:lang w:val="ru-RU"/>
+        </w:rPr>
+        <w:t xml:space="preserve">₅ + </w:t>
+      </w:r>
+      <w:r>
+        <w:t>X</w:t>
+      </w:r>
+      <w:r>
+        <w:rPr>
+          <w:lang w:val="ru-RU"/>
+        </w:rPr>
+        <w:t xml:space="preserve">₆ + </w:t>
+      </w:r>
+      <w:r>
+        <w:t>X</w:t>
+      </w:r>
+      <w:r>
+        <w:rPr>
+          <w:lang w:val="ru-RU"/>
+        </w:rPr>
+        <w:t>₇</w:t>
       </w:r>
     </w:p>
     <w:p>
+      <w:pPr>
+        <w:rPr>
+          <w:lang w:val="ru-RU"/>
+        </w:rPr>
+      </w:pPr>
       <w:r>
+        <w:rPr>
+          <w:lang w:val="ru-RU"/>
+        </w:rPr>
         <w:t>На рисунках 1 и 2 представлены система уравнений и схема с таблицей проверки.</w:t>
       </w:r>
     </w:p>
@@ -935,17 +1440,29 @@
       <w:pPr>
         <w:ind w:firstLine="0"/>
         <w:jc w:val="center"/>
+        <w:rPr>
+          <w:lang w:val="ru-RU"/>
+        </w:rPr>
       </w:pPr>
       <w:r>
         <w:rPr>
           <w:color w:val="000000"/>
           <w:sz w:val="24"/>
+          <w:lang w:val="ru-RU"/>
         </w:rPr>
         <w:t>Рисунок 2 - Схема шифратора и таблица истинности</w:t>
       </w:r>
     </w:p>
     <w:p>
+      <w:pPr>
+        <w:rPr>
+          <w:lang w:val="ru-RU"/>
+        </w:rPr>
+      </w:pPr>
       <w:r>
+        <w:rPr>
+          <w:lang w:val="ru-RU"/>
+        </w:rPr>
         <w:br w:type="page"/>
       </w:r>
     </w:p>
@@ -954,12 +1471,16 @@
         <w:pStyle w:val="21"/>
         <w:ind w:firstLine="0"/>
         <w:jc w:val="center"/>
+        <w:rPr>
+          <w:lang w:val="ru-RU"/>
+        </w:rPr>
       </w:pPr>
       <w:bookmarkStart w:id="4" w:name="_Toc243001096"/>
       <w:r>
         <w:rPr>
           <w:rFonts w:ascii="Times New Roman" w:eastAsia="Times New Roman" w:hAnsi="Times New Roman"/>
           <w:sz w:val="28"/>
+          <w:lang w:val="ru-RU"/>
         </w:rPr>
         <w:lastRenderedPageBreak/>
         <w:t>Задание № 2</w:t>
@@ -967,36 +1488,187 @@
       <w:bookmarkEnd w:id="4"/>
     </w:p>
     <w:p>
+      <w:pPr>
+        <w:rPr>
+          <w:lang w:val="ru-RU"/>
+        </w:rPr>
+      </w:pPr>
       <w:r>
+        <w:rPr>
+          <w:lang w:val="ru-RU"/>
+        </w:rPr>
         <w:t>По таблице истинности варианта составлена следующая система уравнений:</w:t>
       </w:r>
     </w:p>
     <w:p>
       <w:pPr>
         <w:ind w:firstLine="0"/>
+        <w:rPr>
+          <w:lang w:val="ru-RU"/>
+        </w:rPr>
       </w:pPr>
       <w:r>
-        <w:t>Y₁ = X₁ + X₄ + X₇ + X₂</w:t>
+        <w:t>Y</w:t>
+      </w:r>
+      <w:r>
+        <w:rPr>
+          <w:lang w:val="ru-RU"/>
+        </w:rPr>
+        <w:t xml:space="preserve">₁ = </w:t>
+      </w:r>
+      <w:r>
+        <w:t>X</w:t>
+      </w:r>
+      <w:r>
+        <w:rPr>
+          <w:lang w:val="ru-RU"/>
+        </w:rPr>
+        <w:t xml:space="preserve">₁ + </w:t>
+      </w:r>
+      <w:r>
+        <w:t>X</w:t>
+      </w:r>
+      <w:r>
+        <w:rPr>
+          <w:lang w:val="ru-RU"/>
+        </w:rPr>
+        <w:t xml:space="preserve">₄ + </w:t>
+      </w:r>
+      <w:r>
+        <w:t>X</w:t>
+      </w:r>
+      <w:r>
+        <w:rPr>
+          <w:lang w:val="ru-RU"/>
+        </w:rPr>
+        <w:t xml:space="preserve">₇ + </w:t>
+      </w:r>
+      <w:r>
+        <w:t>X</w:t>
+      </w:r>
+      <w:r>
+        <w:rPr>
+          <w:lang w:val="ru-RU"/>
+        </w:rPr>
+        <w:t>₂</w:t>
       </w:r>
     </w:p>
     <w:p>
       <w:pPr>
         <w:ind w:firstLine="0"/>
+        <w:rPr>
+          <w:lang w:val="ru-RU"/>
+        </w:rPr>
       </w:pPr>
       <w:r>
-        <w:t>Y₂ = X₅ + X₄ + X₆ + X₂</w:t>
+        <w:t>Y</w:t>
+      </w:r>
+      <w:r>
+        <w:rPr>
+          <w:lang w:val="ru-RU"/>
+        </w:rPr>
+        <w:t xml:space="preserve">₂ = </w:t>
+      </w:r>
+      <w:r>
+        <w:t>X</w:t>
+      </w:r>
+      <w:r>
+        <w:rPr>
+          <w:lang w:val="ru-RU"/>
+        </w:rPr>
+        <w:t xml:space="preserve">₅ + </w:t>
+      </w:r>
+      <w:r>
+        <w:t>X</w:t>
+      </w:r>
+      <w:r>
+        <w:rPr>
+          <w:lang w:val="ru-RU"/>
+        </w:rPr>
+        <w:t xml:space="preserve">₄ + </w:t>
+      </w:r>
+      <w:r>
+        <w:t>X</w:t>
+      </w:r>
+      <w:r>
+        <w:rPr>
+          <w:lang w:val="ru-RU"/>
+        </w:rPr>
+        <w:t xml:space="preserve">₆ + </w:t>
+      </w:r>
+      <w:r>
+        <w:t>X</w:t>
+      </w:r>
+      <w:r>
+        <w:rPr>
+          <w:lang w:val="ru-RU"/>
+        </w:rPr>
+        <w:t>₂</w:t>
       </w:r>
     </w:p>
     <w:p>
       <w:pPr>
         <w:ind w:firstLine="0"/>
+        <w:rPr>
+          <w:lang w:val="ru-RU"/>
+        </w:rPr>
       </w:pPr>
       <w:r>
-        <w:t>Y₃ = X₀ + X₇ + X₆ + X₂</w:t>
+        <w:t>Y</w:t>
+      </w:r>
+      <w:r>
+        <w:rPr>
+          <w:lang w:val="ru-RU"/>
+        </w:rPr>
+        <w:t xml:space="preserve">₃ = </w:t>
+      </w:r>
+      <w:r>
+        <w:t>X</w:t>
+      </w:r>
+      <w:r>
+        <w:rPr>
+          <w:lang w:val="ru-RU"/>
+        </w:rPr>
+        <w:t xml:space="preserve">₀ + </w:t>
+      </w:r>
+      <w:r>
+        <w:t>X</w:t>
+      </w:r>
+      <w:r>
+        <w:rPr>
+          <w:lang w:val="ru-RU"/>
+        </w:rPr>
+        <w:t xml:space="preserve">₇ + </w:t>
+      </w:r>
+      <w:r>
+        <w:t>X</w:t>
+      </w:r>
+      <w:r>
+        <w:rPr>
+          <w:lang w:val="ru-RU"/>
+        </w:rPr>
+        <w:t xml:space="preserve">₆ + </w:t>
+      </w:r>
+      <w:r>
+        <w:t>X</w:t>
+      </w:r>
+      <w:r>
+        <w:rPr>
+          <w:lang w:val="ru-RU"/>
+        </w:rPr>
+        <w:t>₂</w:t>
       </w:r>
     </w:p>
     <w:p>
+      <w:pPr>
+        <w:rPr>
+          <w:lang w:val="ru-RU"/>
+        </w:rPr>
+      </w:pPr>
       <w:r>
+        <w:rPr>
+          <w:lang w:val="ru-RU"/>
+        </w:rPr>
         <w:t>Логическая схема реализует указанные выражения с помощью элементов ИЛИ. Результат моделирования и таблица истинности используются для проверки соответствия выходов заданным входным комбинациям.</w:t>
       </w:r>
     </w:p>
@@ -1050,11 +1722,15 @@
       <w:pPr>
         <w:ind w:firstLine="0"/>
         <w:jc w:val="center"/>
+        <w:rPr>
+          <w:lang w:val="ru-RU"/>
+        </w:rPr>
       </w:pPr>
       <w:r>
         <w:rPr>
           <w:color w:val="000000"/>
           <w:sz w:val="24"/>
+          <w:lang w:val="ru-RU"/>
         </w:rPr>
         <w:t>Рисунок 3 - Система уравнений для задания №2</w:t>
       </w:r>
@@ -1110,17 +1786,29 @@
       <w:pPr>
         <w:ind w:firstLine="0"/>
         <w:jc w:val="center"/>
+        <w:rPr>
+          <w:lang w:val="ru-RU"/>
+        </w:rPr>
       </w:pPr>
       <w:r>
         <w:rPr>
           <w:color w:val="000000"/>
           <w:sz w:val="24"/>
+          <w:lang w:val="ru-RU"/>
         </w:rPr>
         <w:t>Рисунок 4 - Логическая схема шифратора</w:t>
       </w:r>
     </w:p>
     <w:p>
+      <w:pPr>
+        <w:rPr>
+          <w:lang w:val="ru-RU"/>
+        </w:rPr>
+      </w:pPr>
       <w:r>
+        <w:rPr>
+          <w:lang w:val="ru-RU"/>
+        </w:rPr>
         <w:br w:type="page"/>
       </w:r>
     </w:p>
@@ -1129,12 +1817,16 @@
         <w:pStyle w:val="21"/>
         <w:ind w:firstLine="0"/>
         <w:jc w:val="center"/>
+        <w:rPr>
+          <w:lang w:val="ru-RU"/>
+        </w:rPr>
       </w:pPr>
       <w:bookmarkStart w:id="5" w:name="_Toc243001097"/>
       <w:r>
         <w:rPr>
           <w:rFonts w:ascii="Times New Roman" w:eastAsia="Times New Roman" w:hAnsi="Times New Roman"/>
           <w:sz w:val="28"/>
+          <w:lang w:val="ru-RU"/>
         </w:rPr>
         <w:lastRenderedPageBreak/>
         <w:t>Задание № 3</w:t>
@@ -1142,12 +1834,28 @@
       <w:bookmarkEnd w:id="5"/>
     </w:p>
     <w:p>
+      <w:pPr>
+        <w:rPr>
+          <w:lang w:val="ru-RU"/>
+        </w:rPr>
+      </w:pPr>
       <w:r>
+        <w:rPr>
+          <w:lang w:val="ru-RU"/>
+        </w:rPr>
         <w:t>В задании требуется использовать булеву функцию и таблицу истинности из практической работы №2, построить по ним таблицу истинности шифратора, составить систему уравнений и начертить блок-схему на логических элементах.</w:t>
       </w:r>
     </w:p>
     <w:p>
+      <w:pPr>
+        <w:rPr>
+          <w:lang w:val="ru-RU"/>
+        </w:rPr>
+      </w:pPr>
       <w:r>
+        <w:rPr>
+          <w:lang w:val="ru-RU"/>
+        </w:rPr>
         <w:t>В предоставленных материалах к лабораторной работе отдельные результаты выполнения задания №3 (таблица истинности шифратора и схема) отсутствуют. Поэтому в отчёт не добавлены неподтверждённые таблица и схема.</w:t>
       </w:r>
     </w:p>
@@ -1156,19 +1864,58 @@
         <w:pStyle w:val="1"/>
         <w:ind w:firstLine="0"/>
         <w:jc w:val="center"/>
+        <w:rPr>
+          <w:lang w:val="ru-RU"/>
+        </w:rPr>
       </w:pPr>
       <w:bookmarkStart w:id="6" w:name="_Toc243001098"/>
       <w:r>
         <w:rPr>
           <w:rFonts w:ascii="Times New Roman" w:eastAsia="Times New Roman" w:hAnsi="Times New Roman"/>
+          <w:lang w:val="ru-RU"/>
         </w:rPr>
         <w:t>Вывод</w:t>
       </w:r>
       <w:bookmarkEnd w:id="6"/>
     </w:p>
     <w:p>
+      <w:pPr>
+        <w:rPr>
+          <w:lang w:val="ru-RU"/>
+        </w:rPr>
+      </w:pPr>
       <w:r>
-        <w:t>В ходе лабораторной работы рассмотрен принцип работы шифратора, составлены системы логических уравнений для выходов и представлены логические схемы, реализующие заданные функции. Проверка в Logisim / Logisim evolution позволяет сопоставить значения выходов с входными комбинациями и убедиться в корректности реализации. Для полного завершения третьего задания необходимо добавить его таблицу истинности и схему.</w:t>
+        <w:rPr>
+          <w:lang w:val="ru-RU"/>
+        </w:rPr>
+        <w:t xml:space="preserve">В ходе лабораторной работы рассмотрен принцип работы шифратора, составлены системы логических уравнений для выходов и представлены логические схемы, реализующие заданные функции. Проверка в </w:t>
+      </w:r>
+      <w:r>
+        <w:t>Logisim</w:t>
+      </w:r>
+      <w:r>
+        <w:rPr>
+          <w:lang w:val="ru-RU"/>
+        </w:rPr>
+        <w:t xml:space="preserve"> / </w:t>
+      </w:r>
+      <w:r>
+        <w:t>Logisim</w:t>
+      </w:r>
+      <w:r>
+        <w:rPr>
+          <w:lang w:val="ru-RU"/>
+        </w:rPr>
+        <w:t xml:space="preserve"> </w:t>
+      </w:r>
+      <w:r>
+        <w:t>evolution</w:t>
+      </w:r>
+      <w:r>
+        <w:rPr>
+          <w:lang w:val="ru-RU"/>
+        </w:rPr>
+        <w:t xml:space="preserve"> позволяет сопоставить значения выходов с входными комбинациями и убедиться в корректности реализации. Для полного завершения третьего задания необходимо добавить его таблицу истинности и схему.</w:t>
       </w:r>
     </w:p>
     <w:sectPr>

</xml_diff>